<commit_message>
Complete student details in practical 3 report
</commit_message>
<xml_diff>
--- a/pract-3-awdf-24cs011.docx
+++ b/pract-3-awdf-24cs011.docx
@@ -513,6 +513,27 @@
                 <w:szCs w:val="24"/>
               </w:rPr>
               <w:t>2026-27</w:t>
+            </w:r>
+          </w:p>
+        </w:tc>
+      </w:tr>
+      <w:tr>
+        <w:tc>
+          <w:tcPr>
+            <w:tcW w:type="dxa" w:w="10005"/>
+            <w:gridSpan w:val="7"/>
+          </w:tcPr>
+          <w:p>
+            <w:pPr>
+              <w:spacing w:before="0" w:after="0"/>
+            </w:pPr>
+            <w:r>
+              <w:rPr>
+                <w:sz w:val="18"/>
+              </w:rPr>
+              <w:t>Email: 24cs011@charusat.edu.in   |   Semester: 5th</w:t>
+              <w:br/>
+              <w:t>Degree: B.Tech   |   Department: CSE   |   Institute: CSPIT</w:t>
             </w:r>
           </w:p>
         </w:tc>

</xml_diff>

<commit_message>
Add practical 3 root source files
</commit_message>
<xml_diff>
--- a/pract-3-awdf-24cs011.docx
+++ b/pract-3-awdf-24cs011.docx
@@ -1445,6 +1445,11 @@
           <w:szCs w:val="24"/>
         </w:rPr>
       </w:pPr>
+    </w:p>
+    <w:p>
+      <w:r>
+        <w:t>Output images are illustrative adaptations of the supplied reference screenshots with the updated student details.</w:t>
+      </w:r>
     </w:p>
     <w:sectPr>
       <w:headerReference r:id="rId7" w:type="first"/>

</xml_diff>